<commit_message>
Final version with screenshots
</commit_message>
<xml_diff>
--- a/module-1/RylanderSetup.docx.docx
+++ b/module-1/RylanderSetup.docx.docx
@@ -17,9 +17,21 @@
         <w:t>Jordyn Rylander</w:t>
       </w:r>
     </w:p>
-    <w:p xmlns:wp14="http://schemas.microsoft.com/office/word/2010/wordml" wp14:paraId="6BDFD312" wp14:textId="61563AE2">
-      <w:pPr>
-        <w:spacing w:before="240" w:beforeAutospacing="off" w:after="240" w:afterAutospacing="off"/>
+    <w:p xmlns:wp14="http://schemas.microsoft.com/office/word/2010/wordml" wp14:paraId="22CCF0D3" wp14:textId="5D266661">
+      <w:pPr>
+        <w:pStyle w:val="Normal"/>
+        <w:suppressLineNumbers w:val="0"/>
+        <w:bidi w:val="0"/>
+        <w:spacing w:before="240" w:beforeAutospacing="off" w:after="240" w:afterAutospacing="off" w:line="279" w:lineRule="auto"/>
+        <w:ind w:left="0" w:right="0"/>
+        <w:jc w:val="left"/>
+        <w:rPr>
+          <w:rFonts w:ascii="Aptos" w:hAnsi="Aptos" w:eastAsia="Aptos" w:cs="Aptos"/>
+          <w:noProof w:val="0"/>
+          <w:sz w:val="24"/>
+          <w:szCs w:val="24"/>
+          <w:lang w:val="en-US"/>
+        </w:rPr>
       </w:pPr>
       <w:r>
         <w:rPr>
@@ -29,7 +41,27 @@
           <w:szCs w:val="24"/>
           <w:lang w:val="en-US"/>
         </w:rPr>
-        <w:t>Assignment 1</w:t>
+        <w:t>1.</w:t>
+      </w:r>
+      <w:r>
+        <w:rPr>
+          <w:rFonts w:ascii="Aptos" w:hAnsi="Aptos" w:eastAsia="Aptos" w:cs="Aptos"/>
+          <w:noProof w:val="0"/>
+          <w:sz w:val="24"/>
+          <w:szCs w:val="24"/>
+          <w:lang w:val="en-US"/>
+        </w:rPr>
+        <w:t>2</w:t>
+      </w:r>
+      <w:r>
+        <w:rPr>
+          <w:rFonts w:ascii="Aptos" w:hAnsi="Aptos" w:eastAsia="Aptos" w:cs="Aptos"/>
+          <w:noProof w:val="0"/>
+          <w:sz w:val="24"/>
+          <w:szCs w:val="24"/>
+          <w:lang w:val="en-US"/>
+        </w:rPr>
+        <w:t xml:space="preserve"> Module </w:t>
       </w:r>
     </w:p>
     <w:p xmlns:wp14="http://schemas.microsoft.com/office/word/2010/wordml" wp14:paraId="43BC862A" wp14:textId="13918C2A">
@@ -54,6 +86,40 @@
         <w:t>GitHub Repository Setup</w:t>
       </w:r>
     </w:p>
+    <w:p xmlns:wp14="http://schemas.microsoft.com/office/word/2010/wordml" wp14:paraId="66396EAF" wp14:textId="3FCA39C9">
+      <w:pPr>
+        <w:pStyle w:val="Normal"/>
+        <w:rPr>
+          <w:rFonts w:ascii="Aptos" w:hAnsi="Aptos" w:eastAsia="Aptos" w:cs="Aptos"/>
+          <w:noProof w:val="0"/>
+          <w:sz w:val="24"/>
+          <w:szCs w:val="24"/>
+          <w:lang w:val="en-US"/>
+        </w:rPr>
+      </w:pPr>
+    </w:p>
+    <w:p xmlns:wp14="http://schemas.microsoft.com/office/word/2010/wordml" wp14:paraId="49922282" wp14:textId="43251E57">
+      <w:pPr>
+        <w:pStyle w:val="Normal"/>
+        <w:rPr>
+          <w:rFonts w:ascii="Aptos" w:hAnsi="Aptos" w:eastAsia="Aptos" w:cs="Aptos"/>
+          <w:noProof w:val="0"/>
+          <w:sz w:val="24"/>
+          <w:szCs w:val="24"/>
+          <w:lang w:val="en-US"/>
+        </w:rPr>
+      </w:pPr>
+      <w:r>
+        <w:rPr>
+          <w:rFonts w:ascii="Aptos" w:hAnsi="Aptos" w:eastAsia="Aptos" w:cs="Aptos"/>
+          <w:noProof w:val="0"/>
+          <w:sz w:val="24"/>
+          <w:szCs w:val="24"/>
+          <w:lang w:val="en-US"/>
+        </w:rPr>
+        <w:t>Local Directory Screenshot:</w:t>
+      </w:r>
+    </w:p>
     <w:p xmlns:wp14="http://schemas.microsoft.com/office/word/2010/wordml" wp14:paraId="22F615F7" wp14:textId="0FF1F56E">
       <w:pPr>
         <w:pStyle w:val="Normal"/>
@@ -79,7 +145,7 @@
       </w:pPr>
       <w:r>
         <w:drawing>
-          <wp:inline xmlns:wp14="http://schemas.microsoft.com/office/word/2010/wordprocessingDrawing" wp14:editId="538189E2" wp14:anchorId="3F7022FA">
+          <wp:inline xmlns:wp14="http://schemas.microsoft.com/office/word/2010/wordprocessingDrawing" wp14:editId="02F7678D" wp14:anchorId="3F7022FA">
             <wp:extent cx="4410075" cy="5943600"/>
             <wp:effectExtent l="0" t="0" r="0" b="0"/>
             <wp:docPr id="420094902" name="drawing"/>
@@ -125,7 +191,22 @@
       <w:pPr>
         <w:pStyle w:val="Normal"/>
       </w:pPr>
-      <w:hyperlink r:id="Rf9aad51ef5ce40b1">
+      <w:r>
+        <w:rPr>
+          <w:rFonts w:ascii="Aptos" w:hAnsi="Aptos" w:eastAsia="Aptos" w:cs="Aptos"/>
+          <w:noProof w:val="0"/>
+          <w:sz w:val="24"/>
+          <w:szCs w:val="24"/>
+          <w:lang w:val="en-US"/>
+        </w:rPr>
+        <w:t>GitHub Repository Screenshot:</w:t>
+      </w:r>
+    </w:p>
+    <w:p>
+      <w:pPr>
+        <w:pStyle w:val="Normal"/>
+      </w:pPr>
+      <w:hyperlink r:id="Rb05c288089f04821">
         <w:r>
           <w:rPr>
             <w:rStyle w:val="Hyperlink"/>
@@ -150,9 +231,21 @@
           <w:lang w:val="en-US"/>
         </w:rPr>
       </w:pPr>
+    </w:p>
+    <w:p>
+      <w:pPr>
+        <w:pStyle w:val="Normal"/>
+        <w:rPr>
+          <w:rFonts w:ascii="Aptos" w:hAnsi="Aptos" w:eastAsia="Aptos" w:cs="Aptos"/>
+          <w:noProof w:val="0"/>
+          <w:sz w:val="24"/>
+          <w:szCs w:val="24"/>
+          <w:lang w:val="en-US"/>
+        </w:rPr>
+      </w:pPr>
       <w:r>
         <w:drawing>
-          <wp:inline wp14:editId="66DDC578" wp14:anchorId="25A140D8">
+          <wp:inline wp14:editId="4B2C04A8" wp14:anchorId="25A140D8">
             <wp:extent cx="5943600" cy="3209925"/>
             <wp:effectExtent l="0" t="0" r="0" b="0"/>
             <wp:docPr id="1268875582" name="drawing"/>
@@ -182,6 +275,88 @@
                     <a:xfrm>
                       <a:off x="0" y="0"/>
                       <a:ext cx="5943600" cy="3209925"/>
+                    </a:xfrm>
+                    <a:prstGeom prst="rect">
+                      <a:avLst/>
+                    </a:prstGeom>
+                  </pic:spPr>
+                </pic:pic>
+              </a:graphicData>
+            </a:graphic>
+          </wp:inline>
+        </w:drawing>
+      </w:r>
+    </w:p>
+    <w:p>
+      <w:pPr>
+        <w:pStyle w:val="Normal"/>
+        <w:rPr>
+          <w:rFonts w:ascii="Aptos" w:hAnsi="Aptos" w:eastAsia="Aptos" w:cs="Aptos"/>
+          <w:noProof w:val="0"/>
+          <w:sz w:val="24"/>
+          <w:szCs w:val="24"/>
+          <w:lang w:val="en-US"/>
+        </w:rPr>
+      </w:pPr>
+    </w:p>
+    <w:p>
+      <w:pPr>
+        <w:pStyle w:val="Normal"/>
+      </w:pPr>
+      <w:r>
+        <w:rPr>
+          <w:rFonts w:ascii="Aptos" w:hAnsi="Aptos" w:eastAsia="Aptos" w:cs="Aptos"/>
+          <w:noProof w:val="0"/>
+          <w:sz w:val="24"/>
+          <w:szCs w:val="24"/>
+          <w:lang w:val="en-US"/>
+        </w:rPr>
+        <w:t>Module-1 Folder Screenshot:</w:t>
+      </w:r>
+    </w:p>
+    <w:p>
+      <w:pPr>
+        <w:pStyle w:val="Normal"/>
+        <w:rPr>
+          <w:rFonts w:ascii="Aptos" w:hAnsi="Aptos" w:eastAsia="Aptos" w:cs="Aptos"/>
+          <w:noProof w:val="0"/>
+          <w:sz w:val="24"/>
+          <w:szCs w:val="24"/>
+          <w:lang w:val="en-US"/>
+        </w:rPr>
+      </w:pPr>
+      <w:r>
+        <w:drawing>
+          <wp:inline wp14:editId="37FCDA20" wp14:anchorId="19DD3287">
+            <wp:extent cx="5943600" cy="2476500"/>
+            <wp:effectExtent l="0" t="0" r="0" b="0"/>
+            <wp:docPr id="172843069" name="drawing"/>
+            <wp:cNvGraphicFramePr>
+              <a:graphicFrameLocks noChangeAspect="1"/>
+            </wp:cNvGraphicFramePr>
+            <a:graphic>
+              <a:graphicData xmlns:a="http://schemas.openxmlformats.org/drawingml/2006/main" uri="http://schemas.openxmlformats.org/drawingml/2006/picture">
+                <pic:pic xmlns:pic="http://schemas.openxmlformats.org/drawingml/2006/picture">
+                  <pic:nvPicPr>
+                    <pic:cNvPr id="172843069" name="Picture 172843069"/>
+                    <pic:cNvPicPr/>
+                  </pic:nvPicPr>
+                  <pic:blipFill>
+                    <a:blip xmlns:r="http://schemas.openxmlformats.org/officeDocument/2006/relationships" r:embed="rId766415239">
+                      <a:extLst>
+                        <a:ext uri="{28A0092B-C50C-407E-A947-70E740481C1C}">
+                          <a14:useLocalDpi xmlns:a14="http://schemas.microsoft.com/office/drawing/2010/main"/>
+                        </a:ext>
+                      </a:extLst>
+                    </a:blip>
+                    <a:stretch>
+                      <a:fillRect/>
+                    </a:stretch>
+                  </pic:blipFill>
+                  <pic:spPr>
+                    <a:xfrm>
+                      <a:off x="0" y="0"/>
+                      <a:ext cx="5943600" cy="2476500"/>
                     </a:xfrm>
                     <a:prstGeom prst="rect">
                       <a:avLst/>
@@ -630,7 +805,7 @@
     <w:name w:val="Hyperlink"/>
     <w:basedOn w:val="DefaultParagraphFont"/>
     <w:unhideWhenUsed/>
-    <w:rsid w:val="6F3FD051"/>
+    <w:rsid w:val="1DE46F38"/>
     <w:rPr>
       <w:color w:val="467886"/>
       <w:u w:val="single"/>

</xml_diff>